<commit_message>
Atualização após reunião com orientadora 10/03/2026
</commit_message>
<xml_diff>
--- a/DRP01 - Plano de Ação - Sistema de Cadastro de Clientes.docx
+++ b/DRP01 - Plano de Ação - Sistema de Cadastro de Clientes.docx
@@ -84,6 +84,14 @@
               <w:spacing w:after="0" w:line="360" w:lineRule="auto"/>
             </w:pPr>
             <w:r>
+              <w:t>Gilmar Benedito de Souza Junior, RA 1705846 (Polo Guarulhos - Ciência de Dados)</w:t>
+            </w:r>
+          </w:p>
+          <w:p>
+            <w:pPr>
+              <w:spacing w:after="0" w:line="360" w:lineRule="auto"/>
+            </w:pPr>
+            <w:r>
               <w:t>Kaique Lourenço de Andrade, RA 24214438 (Polo Itapevi - Tecnologia da Informação)</w:t>
             </w:r>
           </w:p>
@@ -92,7 +100,7 @@
               <w:spacing w:after="0" w:line="360" w:lineRule="auto"/>
             </w:pPr>
             <w:r>
-              <w:t>Gilmar Benedito de Souza Junior, RA 1705846 (Polo Guarulhos - Ciência de Dados)</w:t>
+              <w:t>Larissa de Souza Aguiar, RA 24206943 (Polo Embu das Artes - Ciência de Dados)</w:t>
             </w:r>
           </w:p>
           <w:p>
@@ -100,51 +108,43 @@
               <w:spacing w:after="0" w:line="360" w:lineRule="auto"/>
             </w:pPr>
             <w:r>
+              <w:t xml:space="preserve">Luiz Antonio Lopes Junior, RA 1706120 (Polo Mogi das Cruzes </w:t>
+            </w:r>
+            <w:r>
+              <w:t>–</w:t>
+            </w:r>
+            <w:r>
+              <w:t xml:space="preserve"> Eng</w:t>
+            </w:r>
+            <w:r>
+              <w:t>.</w:t>
+            </w:r>
+            <w:r>
+              <w:t xml:space="preserve"> da Computação)</w:t>
+            </w:r>
+          </w:p>
+          <w:p>
+            <w:pPr>
+              <w:spacing w:after="0" w:line="360" w:lineRule="auto"/>
+            </w:pPr>
+            <w:r>
+              <w:t>Maíra Silva Edo, RA 24203688 (Polo Diadema - Ciência de Dados)</w:t>
+            </w:r>
+          </w:p>
+          <w:p>
+            <w:pPr>
+              <w:spacing w:after="0" w:line="360" w:lineRule="auto"/>
+            </w:pPr>
+            <w:r>
+              <w:t>Mariana dos Reis Silva, RA 24210121 (Polo Diadema - Ciência de Dados)</w:t>
+            </w:r>
+          </w:p>
+          <w:p>
+            <w:pPr>
+              <w:spacing w:after="0" w:line="360" w:lineRule="auto"/>
+            </w:pPr>
+            <w:r>
               <w:t>Thiago Augusto Pereira, RA 1811675 (Polo Carapicuiba - Ciência de Dados)</w:t>
-            </w:r>
-          </w:p>
-          <w:p>
-            <w:pPr>
-              <w:spacing w:after="0" w:line="360" w:lineRule="auto"/>
-            </w:pPr>
-            <w:r>
-              <w:t xml:space="preserve">Luiz Antonio Lopes Junior, RA 1706120 (Polo Mogi das Cruzes </w:t>
-            </w:r>
-            <w:r>
-              <w:t>–</w:t>
-            </w:r>
-            <w:r>
-              <w:t xml:space="preserve"> Eng</w:t>
-            </w:r>
-            <w:r>
-              <w:t>.</w:t>
-            </w:r>
-            <w:r>
-              <w:t xml:space="preserve"> da Computação)</w:t>
-            </w:r>
-          </w:p>
-          <w:p>
-            <w:pPr>
-              <w:spacing w:after="0" w:line="360" w:lineRule="auto"/>
-            </w:pPr>
-            <w:r>
-              <w:t>Maíra Silva Edo, RA 24203688 (Polo Diadema - Ciência de Dados)</w:t>
-            </w:r>
-          </w:p>
-          <w:p>
-            <w:pPr>
-              <w:spacing w:after="0" w:line="360" w:lineRule="auto"/>
-            </w:pPr>
-            <w:r>
-              <w:t>Larissa de Souza Aguiar, RA 24206943 (Polo Embu das Artes - Ciência de Dados)</w:t>
-            </w:r>
-          </w:p>
-          <w:p>
-            <w:pPr>
-              <w:spacing w:after="0" w:line="360" w:lineRule="auto"/>
-            </w:pPr>
-            <w:r>
-              <w:t>Mariana dos Reis Silva, RA 24210121 (Polo Diadema - Ciência de Dados)</w:t>
             </w:r>
           </w:p>
           <w:p>
@@ -1236,6 +1236,13 @@
                 <w:rFonts w:ascii="Trebuchet MS" w:hAnsi="Trebuchet MS"/>
                 <w:color w:val="000000" w:themeColor="text1"/>
               </w:rPr>
+              <w:t>, levando em consideração a Lei Geral de Proteção de Dados (LGPD)</w:t>
+            </w:r>
+            <w:r>
+              <w:rPr>
+                <w:rFonts w:ascii="Trebuchet MS" w:hAnsi="Trebuchet MS"/>
+                <w:color w:val="000000" w:themeColor="text1"/>
+              </w:rPr>
               <w:t>.</w:t>
             </w:r>
           </w:p>
@@ -1750,6 +1757,9 @@
             <w:pPr>
               <w:spacing w:after="0"/>
             </w:pPr>
+            <w:r>
+              <w:t>Maíra Silva Edo</w:t>
+            </w:r>
           </w:p>
         </w:tc>
         <w:tc>
@@ -1948,7 +1958,10 @@
               <w:t>emplo</w:t>
             </w:r>
             <w:r>
-              <w:t>: Flask)</w:t>
+              <w:t>: Flask</w:t>
+            </w:r>
+            <w:r>
+              <w:t>, Django)</w:t>
             </w:r>
           </w:p>
         </w:tc>
@@ -2317,6 +2330,9 @@
             <w:pPr>
               <w:spacing w:after="0"/>
             </w:pPr>
+            <w:r>
+              <w:t>Maíra Silva Edo</w:t>
+            </w:r>
           </w:p>
         </w:tc>
         <w:tc>
@@ -2356,6 +2372,9 @@
             <w:pPr>
               <w:spacing w:after="0"/>
             </w:pPr>
+            <w:r>
+              <w:t>Executado</w:t>
+            </w:r>
           </w:p>
         </w:tc>
       </w:tr>
@@ -2387,6 +2406,9 @@
             <w:pPr>
               <w:spacing w:after="0"/>
             </w:pPr>
+            <w:r>
+              <w:t>Todos do grupo</w:t>
+            </w:r>
           </w:p>
         </w:tc>
         <w:tc>
@@ -2604,6 +2626,9 @@
             <w:pPr>
               <w:spacing w:after="0"/>
             </w:pPr>
+            <w:r>
+              <w:t>Larissa de Souza Aguiar</w:t>
+            </w:r>
           </w:p>
         </w:tc>
         <w:tc>
@@ -2949,6 +2974,9 @@
             <w:pPr>
               <w:spacing w:after="0"/>
             </w:pPr>
+            <w:r>
+              <w:t>Maíra Silva Edo</w:t>
+            </w:r>
           </w:p>
         </w:tc>
         <w:tc>
@@ -4183,6 +4211,9 @@
             <w:r>
               <w:t>Excluir cliente</w:t>
             </w:r>
+            <w:r>
+              <w:t>, Perfil de login de administrador</w:t>
+            </w:r>
           </w:p>
         </w:tc>
       </w:tr>
@@ -5255,6 +5286,12 @@
             <w:pPr>
               <w:spacing w:after="0"/>
             </w:pPr>
+            <w:r>
+              <w:t>Coletar assinatura</w:t>
+            </w:r>
+            <w:r>
+              <w:t xml:space="preserve"> da empresa (Termo de autorização de uso de imagem, Termo de autorização da empresa, Termo de Consentimento Livre e Esclarecido)</w:t>
+            </w:r>
           </w:p>
         </w:tc>
       </w:tr>
@@ -5344,6 +5381,7 @@
               <w:spacing w:after="0"/>
             </w:pPr>
             <w:r>
+              <w:lastRenderedPageBreak/>
               <w:t>Revisa</w:t>
             </w:r>
             <w:r>
@@ -5433,6 +5471,9 @@
             </w:pPr>
             <w:r>
               <w:t>Entregar</w:t>
+            </w:r>
+            <w:r>
+              <w:t xml:space="preserve"> Relatório Final com vídeo</w:t>
             </w:r>
           </w:p>
         </w:tc>
@@ -6896,6 +6937,15 @@
 </file>
 
 <file path=customXml/item1.xml><?xml version="1.0" encoding="utf-8"?>
+<?mso-contentType ?>
+<FormTemplates xmlns="http://schemas.microsoft.com/sharepoint/v3/contenttype/forms">
+  <Display>DocumentLibraryForm</Display>
+  <Edit>DocumentLibraryForm</Edit>
+  <New>DocumentLibraryForm</New>
+</FormTemplates>
+</file>
+
+<file path=customXml/item2.xml><?xml version="1.0" encoding="utf-8"?>
 <ct:contentTypeSchema xmlns:ct="http://schemas.microsoft.com/office/2006/metadata/contentType" xmlns:ma="http://schemas.microsoft.com/office/2006/metadata/properties/metaAttributes" ct:_="" ma:_="" ma:contentTypeName="Documento" ma:contentTypeID="0x0101006CFD0211DE75424E90D6B9FC9752CE9C" ma:contentTypeVersion="16" ma:contentTypeDescription="Crie um novo documento." ma:contentTypeScope="" ma:versionID="eb0d476544d351e325591e9e7c010312">
   <xsd:schema xmlns:xsd="http://www.w3.org/2001/XMLSchema" xmlns:xs="http://www.w3.org/2001/XMLSchema" xmlns:p="http://schemas.microsoft.com/office/2006/metadata/properties" xmlns:ns2="7432f127-f33c-42e2-a68a-9048c01697a7" xmlns:ns3="b69dc6fa-2096-41e7-baef-054d5bf17313" targetNamespace="http://schemas.microsoft.com/office/2006/metadata/properties" ma:root="true" ma:fieldsID="090e7113f6b1f759a4c1efa3add07bc2" ns2:_="" ns3:_="">
     <xsd:import namespace="7432f127-f33c-42e2-a68a-9048c01697a7"/>
@@ -7155,39 +7205,7 @@
 </ct:contentTypeSchema>
 </file>
 
-<file path=customXml/item2.xml><?xml version="1.0" encoding="utf-8"?>
-<?mso-contentType ?>
-<FormTemplates xmlns="http://schemas.microsoft.com/sharepoint/v3/contenttype/forms">
-  <Display>DocumentLibraryForm</Display>
-  <Edit>DocumentLibraryForm</Edit>
-  <New>DocumentLibraryForm</New>
-</FormTemplates>
-</file>
-
 <file path=customXml/item3.xml><?xml version="1.0" encoding="utf-8"?>
-<p:properties xmlns:p="http://schemas.microsoft.com/office/2006/metadata/properties" xmlns:xsi="http://www.w3.org/2001/XMLSchema-instance" xmlns:pc="http://schemas.microsoft.com/office/infopath/2007/PartnerControls">
-  <documentManagement>
-    <teste xmlns="7432f127-f33c-42e2-a68a-9048c01697a7" xsi:nil="true"/>
-    <_dlc_DocId xmlns="b69dc6fa-2096-41e7-baef-054d5bf17313">E726VFYCRFHJ-229561519-15240</_dlc_DocId>
-    <_dlc_DocIdUrl xmlns="b69dc6fa-2096-41e7-baef-054d5bf17313">
-      <Url>https://univespprojetomicrosoft.sharepoint.com/sites/DisciplinasGraduacao/_layouts/15/DocIdRedir.aspx?ID=E726VFYCRFHJ-229561519-15240</Url>
-      <Description>E726VFYCRFHJ-229561519-15240</Description>
-    </_dlc_DocIdUrl>
-  </documentManagement>
-</p:properties>
-</file>
-
-<file path=customXml/item4.xml><?xml version="1.0" encoding="utf-8"?>
-<go:gDocsCustomXmlDataStorage xmlns:go="http://customooxmlschemas.google.com/" xmlns:r="http://schemas.openxmlformats.org/officeDocument/2006/relationships">
-  <go:docsCustomData xmlns:go="http://customooxmlschemas.google.com/" roundtripDataSignature="AMtx7mhTsKLM0Xu2rrFPSK8Wu5hhcrD6fw==">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</go:docsCustomData>
-</go:gDocsCustomXmlDataStorage>
-</file>
-
-<file path=customXml/item5.xml><?xml version="1.0" encoding="utf-8"?>
-<b:Sources xmlns:b="http://schemas.openxmlformats.org/officeDocument/2006/bibliography" xmlns="http://schemas.openxmlformats.org/officeDocument/2006/bibliography" SelectedStyle="\APASixthEditionOfficeOnline.xsl" StyleName="APA" Version="6"/>
-</file>
-
-<file path=customXml/item6.xml><?xml version="1.0" encoding="utf-8"?>
 <?mso-contentType ?>
 <spe:Receivers xmlns:spe="http://schemas.microsoft.com/sharepoint/events">
   <Receiver>
@@ -7237,7 +7255,38 @@
 </spe:Receivers>
 </file>
 
+<file path=customXml/item4.xml><?xml version="1.0" encoding="utf-8"?>
+<b:Sources xmlns:b="http://schemas.openxmlformats.org/officeDocument/2006/bibliography" xmlns="http://schemas.openxmlformats.org/officeDocument/2006/bibliography" SelectedStyle="\APASixthEditionOfficeOnline.xsl" StyleName="APA" Version="6"/>
+</file>
+
+<file path=customXml/item5.xml><?xml version="1.0" encoding="utf-8"?>
+<go:gDocsCustomXmlDataStorage xmlns:go="http://customooxmlschemas.google.com/" xmlns:r="http://schemas.openxmlformats.org/officeDocument/2006/relationships">
+  <go:docsCustomData xmlns:go="http://customooxmlschemas.google.com/" roundtripDataSignature="AMtx7mhTsKLM0Xu2rrFPSK8Wu5hhcrD6fw==">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</go:docsCustomData>
+</go:gDocsCustomXmlDataStorage>
+</file>
+
+<file path=customXml/item6.xml><?xml version="1.0" encoding="utf-8"?>
+<p:properties xmlns:p="http://schemas.microsoft.com/office/2006/metadata/properties" xmlns:xsi="http://www.w3.org/2001/XMLSchema-instance" xmlns:pc="http://schemas.microsoft.com/office/infopath/2007/PartnerControls">
+  <documentManagement>
+    <teste xmlns="7432f127-f33c-42e2-a68a-9048c01697a7" xsi:nil="true"/>
+    <_dlc_DocId xmlns="b69dc6fa-2096-41e7-baef-054d5bf17313">E726VFYCRFHJ-229561519-15240</_dlc_DocId>
+    <_dlc_DocIdUrl xmlns="b69dc6fa-2096-41e7-baef-054d5bf17313">
+      <Url>https://univespprojetomicrosoft.sharepoint.com/sites/DisciplinasGraduacao/_layouts/15/DocIdRedir.aspx?ID=E726VFYCRFHJ-229561519-15240</Url>
+      <Description>E726VFYCRFHJ-229561519-15240</Description>
+    </_dlc_DocIdUrl>
+  </documentManagement>
+</p:properties>
+</file>
+
 <file path=customXml/itemProps1.xml><?xml version="1.0" encoding="utf-8"?>
+<ds:datastoreItem xmlns:ds="http://schemas.openxmlformats.org/officeDocument/2006/customXml" ds:itemID="{413DB90E-9A64-442A-AD38-C95AB3E4EF9F}">
+  <ds:schemaRefs>
+    <ds:schemaRef ds:uri="http://schemas.microsoft.com/sharepoint/v3/contenttype/forms"/>
+  </ds:schemaRefs>
+</ds:datastoreItem>
+</file>
+
+<file path=customXml/itemProps2.xml><?xml version="1.0" encoding="utf-8"?>
 <ds:datastoreItem xmlns:ds="http://schemas.openxmlformats.org/officeDocument/2006/customXml" ds:itemID="{27178C62-D9D3-4513-B322-2098833940E5}">
   <ds:schemaRefs>
     <ds:schemaRef ds:uri="http://schemas.microsoft.com/office/2006/metadata/contentType"/>
@@ -7256,15 +7305,32 @@
 </ds:datastoreItem>
 </file>
 
-<file path=customXml/itemProps2.xml><?xml version="1.0" encoding="utf-8"?>
-<ds:datastoreItem xmlns:ds="http://schemas.openxmlformats.org/officeDocument/2006/customXml" ds:itemID="{413DB90E-9A64-442A-AD38-C95AB3E4EF9F}">
+<file path=customXml/itemProps3.xml><?xml version="1.0" encoding="utf-8"?>
+<ds:datastoreItem xmlns:ds="http://schemas.openxmlformats.org/officeDocument/2006/customXml" ds:itemID="{001C8AF1-0A5A-4192-973C-413DD19C3B92}">
   <ds:schemaRefs>
-    <ds:schemaRef ds:uri="http://schemas.microsoft.com/sharepoint/v3/contenttype/forms"/>
+    <ds:schemaRef ds:uri="http://schemas.microsoft.com/sharepoint/events"/>
   </ds:schemaRefs>
 </ds:datastoreItem>
 </file>
 
-<file path=customXml/itemProps3.xml><?xml version="1.0" encoding="utf-8"?>
+<file path=customXml/itemProps4.xml><?xml version="1.0" encoding="utf-8"?>
+<ds:datastoreItem xmlns:ds="http://schemas.openxmlformats.org/officeDocument/2006/customXml" ds:itemID="{B4A64242-4ED2-4431-9BBC-6C9F087A3F0B}">
+  <ds:schemaRefs>
+    <ds:schemaRef ds:uri="http://schemas.openxmlformats.org/officeDocument/2006/bibliography"/>
+  </ds:schemaRefs>
+</ds:datastoreItem>
+</file>
+
+<file path=customXml/itemProps5.xml><?xml version="1.0" encoding="utf-8"?>
+<ds:datastoreItem xmlns:ds="http://schemas.openxmlformats.org/officeDocument/2006/customXml" ds:itemID="{11111111-1234-1234-1234-123412341234}">
+  <ds:schemaRefs>
+    <ds:schemaRef ds:uri="http://customooxmlschemas.google.com/"/>
+    <ds:schemaRef ds:uri="http://schemas.openxmlformats.org/officeDocument/2006/relationships"/>
+  </ds:schemaRefs>
+</ds:datastoreItem>
+</file>
+
+<file path=customXml/itemProps6.xml><?xml version="1.0" encoding="utf-8"?>
 <ds:datastoreItem xmlns:ds="http://schemas.openxmlformats.org/officeDocument/2006/customXml" ds:itemID="{AB6D30A6-B7AA-49D0-8DAC-77DF30570A2D}">
   <ds:schemaRefs>
     <ds:schemaRef ds:uri="http://schemas.microsoft.com/office/2006/metadata/properties"/>
@@ -7273,29 +7339,4 @@
     <ds:schemaRef ds:uri="b69dc6fa-2096-41e7-baef-054d5bf17313"/>
   </ds:schemaRefs>
 </ds:datastoreItem>
-</file>
-
-<file path=customXml/itemProps4.xml><?xml version="1.0" encoding="utf-8"?>
-<ds:datastoreItem xmlns:ds="http://schemas.openxmlformats.org/officeDocument/2006/customXml" ds:itemID="{11111111-1234-1234-1234-123412341234}">
-  <ds:schemaRefs>
-    <ds:schemaRef ds:uri="http://customooxmlschemas.google.com/"/>
-    <ds:schemaRef ds:uri="http://schemas.openxmlformats.org/officeDocument/2006/relationships"/>
-  </ds:schemaRefs>
-</ds:datastoreItem>
-</file>
-
-<file path=customXml/itemProps5.xml><?xml version="1.0" encoding="utf-8"?>
-<ds:datastoreItem xmlns:ds="http://schemas.openxmlformats.org/officeDocument/2006/customXml" ds:itemID="{B4A64242-4ED2-4431-9BBC-6C9F087A3F0B}">
-  <ds:schemaRefs>
-    <ds:schemaRef ds:uri="http://schemas.openxmlformats.org/officeDocument/2006/bibliography"/>
-  </ds:schemaRefs>
-</ds:datastoreItem>
-</file>
-
-<file path=customXml/itemProps6.xml><?xml version="1.0" encoding="utf-8"?>
-<ds:datastoreItem xmlns:ds="http://schemas.openxmlformats.org/officeDocument/2006/customXml" ds:itemID="{001C8AF1-0A5A-4192-973C-413DD19C3B92}">
-  <ds:schemaRefs>
-    <ds:schemaRef ds:uri="http://schemas.microsoft.com/sharepoint/events"/>
-  </ds:schemaRefs>
-</ds:datastoreItem>
 </file>
</xml_diff>